<commit_message>
Harden auth security, fix Resend env detection, and organize dashboard hubs.
</commit_message>
<xml_diff>
--- a/docs/VIVRANT_Complete_Project_Documentation_SDLC.docx
+++ b/docs/VIVRANT_Complete_Project_Documentation_SDLC.docx
@@ -187,7 +187,7 @@
               <w:rPr>
                 <w:sz w:val="20"/>
               </w:rPr>
-              <w:t>2.0 / QA gate complete — August 4, 2026</w:t>
+              <w:t>2.1 / QA re-verified locally — August 4, 2026</w:t>
             </w:r>
           </w:p>
         </w:tc>
@@ -369,7 +369,7 @@
           <w:b w:val="0"/>
           <w:sz w:val="22"/>
         </w:rPr>
-        <w:t>This revision replaces the July 20, 2026 baseline. It consolidates the live VIVRΛNT Web and Flutter mobile products, documents the automated Quality Assurance gate executed on August 4, 2026, and records residual risks with owners.</w:t>
+        <w:t>This revision updates the August 4, 2026 QA baseline with a full local re-verification (`npm run qa`, `npm run qa:smoke`, `flutter test`) and tooling cleanup (`vitest.config.mts` to remove the Vite ESM warning). It consolidates VIVRΛNT Web and Flutter mobile, documents the automated Quality Assurance gate, and records residual risks with owners.</w:t>
       </w:r>
     </w:p>
     <w:p>
@@ -608,6 +608,60 @@
                 <w:sz w:val="20"/>
               </w:rPr>
               <w:t>Full VIVRΛNT Web+Mobile baseline; QA suite implemented; test evidence recorded; auth/reminder/security hardening; production redeploy</w:t>
+            </w:r>
+          </w:p>
+        </w:tc>
+      </w:tr>
+      <w:tr>
+        <w:tc>
+          <w:tcPr>
+            <w:tcW w:type="dxa" w:w="2412"/>
+          </w:tcPr>
+          <w:p>
+            <w:r>
+              <w:rPr>
+                <w:sz w:val="20"/>
+              </w:rPr>
+              <w:t>2.1</w:t>
+            </w:r>
+          </w:p>
+        </w:tc>
+        <w:tc>
+          <w:tcPr>
+            <w:tcW w:type="dxa" w:w="2412"/>
+          </w:tcPr>
+          <w:p>
+            <w:r>
+              <w:rPr>
+                <w:sz w:val="20"/>
+              </w:rPr>
+              <w:t>2026-08-04</w:t>
+            </w:r>
+          </w:p>
+        </w:tc>
+        <w:tc>
+          <w:tcPr>
+            <w:tcW w:type="dxa" w:w="2412"/>
+          </w:tcPr>
+          <w:p>
+            <w:r>
+              <w:rPr>
+                <w:sz w:val="20"/>
+              </w:rPr>
+              <w:t>Daniella Sayson</w:t>
+            </w:r>
+          </w:p>
+        </w:tc>
+        <w:tc>
+          <w:tcPr>
+            <w:tcW w:type="dxa" w:w="2412"/>
+          </w:tcPr>
+          <w:p>
+            <w:r>
+              <w:rPr>
+                <w:sz w:val="20"/>
+              </w:rPr>
+              <w:t>Local re-verification: npm run qa PASS, qa:smoke 5/5, flutter test 13/13; Vitest config moved to .mts (no ESM warning)</w:t>
             </w:r>
           </w:p>
         </w:tc>
@@ -2003,7 +2057,7 @@
               <w:rPr>
                 <w:sz w:val="20"/>
               </w:rPr>
-              <w:t>PASS</w:t>
+              <w:t>PASS (re-verified locally ~10:52)</w:t>
             </w:r>
           </w:p>
         </w:tc>
@@ -2044,7 +2098,7 @@
               <w:rPr>
                 <w:sz w:val="20"/>
               </w:rPr>
-              <w:t>PASS (0 errors after fixes)</w:t>
+              <w:t>PASS — 0 errors</w:t>
             </w:r>
           </w:p>
         </w:tc>
@@ -2141,7 +2195,7 @@
               <w:rPr>
                 <w:sz w:val="20"/>
               </w:rPr>
-              <w:t>Mobile tests</w:t>
+              <w:t>Production smoke</w:t>
             </w:r>
           </w:p>
         </w:tc>
@@ -2154,7 +2208,7 @@
               <w:rPr>
                 <w:sz w:val="20"/>
               </w:rPr>
-              <w:t>flutter test</w:t>
+              <w:t>npm run qa:smoke</w:t>
             </w:r>
           </w:p>
         </w:tc>
@@ -2167,7 +2221,7 @@
               <w:rPr>
                 <w:sz w:val="20"/>
               </w:rPr>
-              <w:t>PASS — 13/13</w:t>
+              <w:t>PASS — 5/5 against viva-server-delta.vercel.app</w:t>
             </w:r>
           </w:p>
         </w:tc>
@@ -2182,7 +2236,7 @@
               <w:rPr>
                 <w:sz w:val="20"/>
               </w:rPr>
-              <w:t>Mobile analyzer</w:t>
+              <w:t>Mobile tests</w:t>
             </w:r>
           </w:p>
         </w:tc>
@@ -2195,7 +2249,7 @@
               <w:rPr>
                 <w:sz w:val="20"/>
               </w:rPr>
-              <w:t>flutter analyze lib test</w:t>
+              <w:t>flutter test</w:t>
             </w:r>
           </w:p>
         </w:tc>
@@ -2208,7 +2262,7 @@
               <w:rPr>
                 <w:sz w:val="20"/>
               </w:rPr>
-              <w:t>INFO-level style findings only; no failing tests</w:t>
+              <w:t>PASS — 13/13</w:t>
             </w:r>
           </w:p>
         </w:tc>
@@ -2223,7 +2277,7 @@
               <w:rPr>
                 <w:sz w:val="20"/>
               </w:rPr>
-              <w:t>Production smoke</w:t>
+              <w:t>Mobile analyzer</w:t>
             </w:r>
           </w:p>
         </w:tc>
@@ -2236,7 +2290,7 @@
               <w:rPr>
                 <w:sz w:val="20"/>
               </w:rPr>
-              <w:t>npm run qa:smoke</w:t>
+              <w:t>flutter analyze lib test --no-fatal-infos</w:t>
             </w:r>
           </w:p>
         </w:tc>
@@ -2249,7 +2303,7 @@
               <w:rPr>
                 <w:sz w:val="20"/>
               </w:rPr>
-              <w:t>4/5 PASS prior to auth-catch redeploy; unauth Today expected 401 after deploy</w:t>
+              <w:t>INFO-only style findings; tests green</w:t>
             </w:r>
           </w:p>
         </w:tc>
@@ -2264,6 +2318,47 @@
               <w:rPr>
                 <w:sz w:val="20"/>
               </w:rPr>
+              <w:t>Vitest config</w:t>
+            </w:r>
+          </w:p>
+        </w:tc>
+        <w:tc>
+          <w:tcPr>
+            <w:tcW w:type="dxa" w:w="3216"/>
+          </w:tcPr>
+          <w:p>
+            <w:r>
+              <w:rPr>
+                <w:sz w:val="20"/>
+              </w:rPr>
+              <w:t>vitest.config.mts</w:t>
+            </w:r>
+          </w:p>
+        </w:tc>
+        <w:tc>
+          <w:tcPr>
+            <w:tcW w:type="dxa" w:w="3216"/>
+          </w:tcPr>
+          <w:p>
+            <w:r>
+              <w:rPr>
+                <w:sz w:val="20"/>
+              </w:rPr>
+              <w:t>ESM warning cleared (no longer .ts CJS load)</w:t>
+            </w:r>
+          </w:p>
+        </w:tc>
+      </w:tr>
+      <w:tr>
+        <w:tc>
+          <w:tcPr>
+            <w:tcW w:type="dxa" w:w="3216"/>
+          </w:tcPr>
+          <w:p>
+            <w:r>
+              <w:rPr>
+                <w:sz w:val="20"/>
+              </w:rPr>
               <w:t>Production deploy</w:t>
             </w:r>
           </w:p>
@@ -2291,6 +2386,277 @@
                 <w:sz w:val="20"/>
               </w:rPr>
               <w:t>READY — https://viva-server-delta.vercel.app</w:t>
+            </w:r>
+          </w:p>
+        </w:tc>
+      </w:tr>
+    </w:tbl>
+    <w:p>
+      <w:r>
+        <w:rPr>
+          <w:rFonts w:ascii="Calibri" w:hAnsi="Calibri"/>
+          <w:b/>
+          <w:sz w:val="22"/>
+        </w:rPr>
+        <w:t>Smoke detail (production)</w:t>
+      </w:r>
+    </w:p>
+    <w:tbl>
+      <w:tblPr>
+        <w:tblStyle w:val="TableGrid"/>
+        <w:tblW w:type="auto" w:w="0"/>
+        <w:tblLook w:firstColumn="1" w:firstRow="1" w:lastColumn="0" w:lastRow="0" w:noHBand="0" w:noVBand="1" w:val="04A0"/>
+      </w:tblPr>
+      <w:tblGrid>
+        <w:gridCol w:w="3216"/>
+        <w:gridCol w:w="3216"/>
+        <w:gridCol w:w="3216"/>
+      </w:tblGrid>
+      <w:tr>
+        <w:tc>
+          <w:tcPr>
+            <w:tcW w:type="dxa" w:w="3216"/>
+          </w:tcPr>
+          <w:p>
+            <w:r>
+              <w:rPr>
+                <w:b/>
+                <w:sz w:val="20"/>
+              </w:rPr>
+              <w:t>Check</w:t>
+            </w:r>
+          </w:p>
+        </w:tc>
+        <w:tc>
+          <w:tcPr>
+            <w:tcW w:type="dxa" w:w="3216"/>
+          </w:tcPr>
+          <w:p>
+            <w:r>
+              <w:rPr>
+                <w:b/>
+                <w:sz w:val="20"/>
+              </w:rPr>
+              <w:t>Expected</w:t>
+            </w:r>
+          </w:p>
+        </w:tc>
+        <w:tc>
+          <w:tcPr>
+            <w:tcW w:type="dxa" w:w="3216"/>
+          </w:tcPr>
+          <w:p>
+            <w:r>
+              <w:rPr>
+                <w:b/>
+                <w:sz w:val="20"/>
+              </w:rPr>
+              <w:t>Actual</w:t>
+            </w:r>
+          </w:p>
+        </w:tc>
+      </w:tr>
+      <w:tr>
+        <w:tc>
+          <w:tcPr>
+            <w:tcW w:type="dxa" w:w="3216"/>
+          </w:tcPr>
+          <w:p>
+            <w:r>
+              <w:rPr>
+                <w:sz w:val="20"/>
+              </w:rPr>
+              <w:t>Landing /</w:t>
+            </w:r>
+          </w:p>
+        </w:tc>
+        <w:tc>
+          <w:tcPr>
+            <w:tcW w:type="dxa" w:w="3216"/>
+          </w:tcPr>
+          <w:p>
+            <w:r>
+              <w:rPr>
+                <w:sz w:val="20"/>
+              </w:rPr>
+              <w:t>200</w:t>
+            </w:r>
+          </w:p>
+        </w:tc>
+        <w:tc>
+          <w:tcPr>
+            <w:tcW w:type="dxa" w:w="3216"/>
+          </w:tcPr>
+          <w:p>
+            <w:r>
+              <w:rPr>
+                <w:sz w:val="20"/>
+              </w:rPr>
+              <w:t>PASS 200</w:t>
+            </w:r>
+          </w:p>
+        </w:tc>
+      </w:tr>
+      <w:tr>
+        <w:tc>
+          <w:tcPr>
+            <w:tcW w:type="dxa" w:w="3216"/>
+          </w:tcPr>
+          <w:p>
+            <w:r>
+              <w:rPr>
+                <w:sz w:val="20"/>
+              </w:rPr>
+              <w:t>Login /login</w:t>
+            </w:r>
+          </w:p>
+        </w:tc>
+        <w:tc>
+          <w:tcPr>
+            <w:tcW w:type="dxa" w:w="3216"/>
+          </w:tcPr>
+          <w:p>
+            <w:r>
+              <w:rPr>
+                <w:sz w:val="20"/>
+              </w:rPr>
+              <w:t>200</w:t>
+            </w:r>
+          </w:p>
+        </w:tc>
+        <w:tc>
+          <w:tcPr>
+            <w:tcW w:type="dxa" w:w="3216"/>
+          </w:tcPr>
+          <w:p>
+            <w:r>
+              <w:rPr>
+                <w:sz w:val="20"/>
+              </w:rPr>
+              <w:t>PASS 200</w:t>
+            </w:r>
+          </w:p>
+        </w:tc>
+      </w:tr>
+      <w:tr>
+        <w:tc>
+          <w:tcPr>
+            <w:tcW w:type="dxa" w:w="3216"/>
+          </w:tcPr>
+          <w:p>
+            <w:r>
+              <w:rPr>
+                <w:sz w:val="20"/>
+              </w:rPr>
+              <w:t>Firebase SW /api/firebase-messaging-sw</w:t>
+            </w:r>
+          </w:p>
+        </w:tc>
+        <w:tc>
+          <w:tcPr>
+            <w:tcW w:type="dxa" w:w="3216"/>
+          </w:tcPr>
+          <w:p>
+            <w:r>
+              <w:rPr>
+                <w:sz w:val="20"/>
+              </w:rPr>
+              <w:t>200</w:t>
+            </w:r>
+          </w:p>
+        </w:tc>
+        <w:tc>
+          <w:tcPr>
+            <w:tcW w:type="dxa" w:w="3216"/>
+          </w:tcPr>
+          <w:p>
+            <w:r>
+              <w:rPr>
+                <w:sz w:val="20"/>
+              </w:rPr>
+              <w:t>PASS 200</w:t>
+            </w:r>
+          </w:p>
+        </w:tc>
+      </w:tr>
+      <w:tr>
+        <w:tc>
+          <w:tcPr>
+            <w:tcW w:type="dxa" w:w="3216"/>
+          </w:tcPr>
+          <w:p>
+            <w:r>
+              <w:rPr>
+                <w:sz w:val="20"/>
+              </w:rPr>
+              <w:t>Mobile Today unauthenticated</w:t>
+            </w:r>
+          </w:p>
+        </w:tc>
+        <w:tc>
+          <w:tcPr>
+            <w:tcW w:type="dxa" w:w="3216"/>
+          </w:tcPr>
+          <w:p>
+            <w:r>
+              <w:rPr>
+                <w:sz w:val="20"/>
+              </w:rPr>
+              <w:t>401</w:t>
+            </w:r>
+          </w:p>
+        </w:tc>
+        <w:tc>
+          <w:tcPr>
+            <w:tcW w:type="dxa" w:w="3216"/>
+          </w:tcPr>
+          <w:p>
+            <w:r>
+              <w:rPr>
+                <w:sz w:val="20"/>
+              </w:rPr>
+              <w:t>PASS 401</w:t>
+            </w:r>
+          </w:p>
+        </w:tc>
+      </w:tr>
+      <w:tr>
+        <w:tc>
+          <w:tcPr>
+            <w:tcW w:type="dxa" w:w="3216"/>
+          </w:tcPr>
+          <w:p>
+            <w:r>
+              <w:rPr>
+                <w:sz w:val="20"/>
+              </w:rPr>
+              <w:t>Auth login validation POST</w:t>
+            </w:r>
+          </w:p>
+        </w:tc>
+        <w:tc>
+          <w:tcPr>
+            <w:tcW w:type="dxa" w:w="3216"/>
+          </w:tcPr>
+          <w:p>
+            <w:r>
+              <w:rPr>
+                <w:sz w:val="20"/>
+              </w:rPr>
+              <w:t>400</w:t>
+            </w:r>
+          </w:p>
+        </w:tc>
+        <w:tc>
+          <w:tcPr>
+            <w:tcW w:type="dxa" w:w="3216"/>
+          </w:tcPr>
+          <w:p>
+            <w:r>
+              <w:rPr>
+                <w:sz w:val="20"/>
+              </w:rPr>
+              <w:t>PASS 400</w:t>
             </w:r>
           </w:p>
         </w:tc>
@@ -4564,7 +4930,7 @@
               <w:rPr>
                 <w:sz w:val="20"/>
               </w:rPr>
-              <w:t>Vitest 21 + Flutter 13 + lint/typecheck</w:t>
+              <w:t>Vitest 21 + Flutter 13 + lint/typecheck + smoke 5/5</w:t>
             </w:r>
           </w:p>
         </w:tc>
@@ -4577,7 +4943,7 @@
               <w:rPr>
                 <w:sz w:val="20"/>
               </w:rPr>
-              <w:t>Complete (Aug 4, 2026)</w:t>
+              <w:t>Complete &amp; re-verified (Aug 4, 2026)</w:t>
             </w:r>
           </w:p>
         </w:tc>
@@ -4646,7 +5012,7 @@
               <w:rPr>
                 <w:sz w:val="20"/>
               </w:rPr>
-              <w:t>Vercel production READY</w:t>
+              <w:t>Vercel production READY; smoke 5/5</w:t>
             </w:r>
           </w:p>
         </w:tc>

</xml_diff>